<commit_message>
MED-237 improve template for slugbova
</commit_message>
<xml_diff>
--- a/RightholderWorkplace/Templates/F_Службова до юридичного деп.docx
+++ b/RightholderWorkplace/Templates/F_Службова до юридичного деп.docx
@@ -638,6 +638,14 @@
           </w:r>
         </w:sdtContent>
       </w:sdt>
+      <w:r>
+        <w:rPr>
+          <w:rFonts w:ascii="Times New Roman" w:hAnsi="Times New Roman" w:cs="Times New Roman"/>
+          <w:sz w:val="24"/>
+          <w:szCs w:val="24"/>
+        </w:rPr>
+        <w:t>.</w:t>
+      </w:r>
     </w:p>
     <w:p>
       <w:pPr>
@@ -686,13 +694,41 @@
         </w:rPr>
         <w:t xml:space="preserve"> від </w:t>
       </w:r>
+      <w:sdt>
+        <w:sdtPr>
+          <w:rPr>
+            <w:rFonts w:ascii="Times New Roman" w:hAnsi="Times New Roman" w:cs="Times New Roman"/>
+            <w:sz w:val="24"/>
+            <w:szCs w:val="24"/>
+            <w:lang w:val="en-US"/>
+          </w:rPr>
+          <w:alias w:val="fixDate"/>
+          <w:id w:val="-1331597531"/>
+          <w:placeholder>
+            <w:docPart w:val="0B10657EFB7A4E749CF332D707B4CB82"/>
+          </w:placeholder>
+          <w:showingPlcHdr/>
+          <w15:appearance w15:val="tags"/>
+          <w:text/>
+        </w:sdtPr>
+        <w:sdtEndPr/>
+        <w:sdtContent>
+          <w:r>
+            <w:rPr>
+              <w:rStyle w:val="ad"/>
+            </w:rPr>
+            <w:t>Место для ввода текста.</w:t>
+          </w:r>
+        </w:sdtContent>
+      </w:sdt>
       <w:r>
         <w:rPr>
           <w:rFonts w:ascii="Times New Roman" w:hAnsi="Times New Roman" w:cs="Times New Roman"/>
           <w:sz w:val="24"/>
           <w:szCs w:val="24"/>
-        </w:rPr>
-        <w:t xml:space="preserve">______________ </w:t>
+          <w:lang w:val="uk-UA"/>
+        </w:rPr>
+        <w:t xml:space="preserve"> </w:t>
       </w:r>
       <w:r>
         <w:rPr>
@@ -717,9 +753,8 @@
           <w:rFonts w:ascii="Times New Roman" w:hAnsi="Times New Roman" w:cs="Times New Roman"/>
           <w:sz w:val="24"/>
           <w:szCs w:val="24"/>
-          <w:lang w:val="uk-UA"/>
-        </w:rPr>
-        <w:t>1</w:t>
+        </w:rPr>
+        <w:t>2</w:t>
       </w:r>
       <w:r>
         <w:rPr>
@@ -728,7 +763,27 @@
           <w:szCs w:val="24"/>
           <w:lang w:val="uk-UA"/>
         </w:rPr>
-        <w:t xml:space="preserve"> арк.</w:t>
+        <w:t xml:space="preserve"> </w:t>
+      </w:r>
+      <w:proofErr w:type="spellStart"/>
+      <w:r>
+        <w:rPr>
+          <w:rFonts w:ascii="Times New Roman" w:hAnsi="Times New Roman" w:cs="Times New Roman"/>
+          <w:sz w:val="24"/>
+          <w:szCs w:val="24"/>
+          <w:lang w:val="uk-UA"/>
+        </w:rPr>
+        <w:t>арк</w:t>
+      </w:r>
+      <w:proofErr w:type="spellEnd"/>
+      <w:r>
+        <w:rPr>
+          <w:rFonts w:ascii="Times New Roman" w:hAnsi="Times New Roman" w:cs="Times New Roman"/>
+          <w:sz w:val="24"/>
+          <w:szCs w:val="24"/>
+          <w:lang w:val="uk-UA"/>
+        </w:rPr>
+        <w:t>.</w:t>
       </w:r>
     </w:p>
     <w:p>
@@ -756,9 +811,8 @@
           <w:rFonts w:ascii="Times New Roman" w:hAnsi="Times New Roman" w:cs="Times New Roman"/>
           <w:sz w:val="24"/>
           <w:szCs w:val="24"/>
-          <w:lang w:val="uk-UA"/>
-        </w:rPr>
-        <w:t>3</w:t>
+        </w:rPr>
+        <w:t>___</w:t>
       </w:r>
       <w:r>
         <w:rPr>
@@ -767,7 +821,27 @@
           <w:szCs w:val="24"/>
           <w:lang w:val="uk-UA"/>
         </w:rPr>
-        <w:t xml:space="preserve"> арк.</w:t>
+        <w:t xml:space="preserve"> </w:t>
+      </w:r>
+      <w:proofErr w:type="spellStart"/>
+      <w:r>
+        <w:rPr>
+          <w:rFonts w:ascii="Times New Roman" w:hAnsi="Times New Roman" w:cs="Times New Roman"/>
+          <w:sz w:val="24"/>
+          <w:szCs w:val="24"/>
+          <w:lang w:val="uk-UA"/>
+        </w:rPr>
+        <w:t>арк</w:t>
+      </w:r>
+      <w:proofErr w:type="spellEnd"/>
+      <w:r>
+        <w:rPr>
+          <w:rFonts w:ascii="Times New Roman" w:hAnsi="Times New Roman" w:cs="Times New Roman"/>
+          <w:sz w:val="24"/>
+          <w:szCs w:val="24"/>
+          <w:lang w:val="uk-UA"/>
+        </w:rPr>
+        <w:t>.</w:t>
       </w:r>
     </w:p>
     <w:p>
@@ -1023,39 +1097,56 @@
           <w:rFonts w:ascii="Times New Roman" w:hAnsi="Times New Roman"/>
           <w:sz w:val="18"/>
           <w:szCs w:val="18"/>
+          <w:lang w:val="en-US" w:eastAsia="ru-RU"/>
+        </w:rPr>
+      </w:pPr>
+      <w:r>
+        <w:rPr>
+          <w:rFonts w:ascii="Times New Roman" w:hAnsi="Times New Roman"/>
+          <w:sz w:val="18"/>
+          <w:szCs w:val="18"/>
           <w:lang w:val="ru-RU" w:eastAsia="ru-RU"/>
         </w:rPr>
-      </w:pPr>
-    </w:p>
-    <w:p>
-      <w:pPr>
+        <w:t>Вик.</w:t>
+      </w:r>
+      <w:r>
         <w:rPr>
           <w:rFonts w:ascii="Times New Roman" w:hAnsi="Times New Roman"/>
           <w:sz w:val="18"/>
           <w:szCs w:val="18"/>
           <w:lang w:val="en-US" w:eastAsia="ru-RU"/>
         </w:rPr>
-      </w:pPr>
-      <w:r>
-        <w:rPr>
-          <w:rFonts w:ascii="Times New Roman" w:hAnsi="Times New Roman"/>
-          <w:sz w:val="18"/>
-          <w:szCs w:val="18"/>
-          <w:lang w:val="ru-RU" w:eastAsia="ru-RU"/>
-        </w:rPr>
-        <w:t>Вик.</w:t>
-      </w:r>
-      <w:r>
-        <w:rPr>
-          <w:rFonts w:ascii="Times New Roman" w:hAnsi="Times New Roman"/>
-          <w:sz w:val="18"/>
-          <w:szCs w:val="18"/>
-          <w:lang w:val="en-US" w:eastAsia="ru-RU"/>
-        </w:rPr>
-        <w:t xml:space="preserve"> ____________________________</w:t>
-      </w:r>
-      <w:bookmarkStart w:id="0" w:name="_GoBack"/>
-      <w:bookmarkEnd w:id="0"/>
+        <w:t xml:space="preserve"> </w:t>
+      </w:r>
+      <w:sdt>
+        <w:sdtPr>
+          <w:rPr>
+            <w:rFonts w:ascii="Times New Roman" w:hAnsi="Times New Roman"/>
+            <w:sz w:val="24"/>
+            <w:szCs w:val="24"/>
+            <w:lang w:val="en-US"/>
+          </w:rPr>
+          <w:alias w:val="fixEmployee"/>
+          <w:tag w:val="fixEmployee"/>
+          <w:id w:val="-1206095744"/>
+          <w:placeholder>
+            <w:docPart w:val="951A225EF0084B0BAB7353E9C0BAFA97"/>
+          </w:placeholder>
+          <w:showingPlcHdr/>
+          <w15:appearance w15:val="tags"/>
+          <w:text/>
+        </w:sdtPr>
+        <w:sdtEndPr/>
+        <w:sdtContent>
+          <w:r>
+            <w:rPr>
+              <w:rStyle w:val="ad"/>
+              <w:sz w:val="18"/>
+            </w:rPr>
+            <w:t>Место для ввода текста.</w:t>
+          </w:r>
+        </w:sdtContent>
+      </w:sdt>
     </w:p>
     <w:sectPr>
       <w:pgSz w:w="11906" w:h="16838"/>
@@ -2002,6 +2093,64 @@
         </w:p>
       </w:docPartBody>
     </w:docPart>
+    <w:docPart>
+      <w:docPartPr>
+        <w:name w:val="0B10657EFB7A4E749CF332D707B4CB82"/>
+        <w:category>
+          <w:name w:val="Общие"/>
+          <w:gallery w:val="placeholder"/>
+        </w:category>
+        <w:types>
+          <w:type w:val="bbPlcHdr"/>
+        </w:types>
+        <w:behaviors>
+          <w:behavior w:val="content"/>
+        </w:behaviors>
+        <w:guid w:val="{AE111A82-8515-4D55-9251-531B16DFC872}"/>
+      </w:docPartPr>
+      <w:docPartBody>
+        <w:p>
+          <w:pPr>
+            <w:pStyle w:val="0B10657EFB7A4E749CF332D707B4CB82"/>
+          </w:pPr>
+          <w:r>
+            <w:rPr>
+              <w:rStyle w:val="a3"/>
+            </w:rPr>
+            <w:t>Место для ввода текста.</w:t>
+          </w:r>
+        </w:p>
+      </w:docPartBody>
+    </w:docPart>
+    <w:docPart>
+      <w:docPartPr>
+        <w:name w:val="951A225EF0084B0BAB7353E9C0BAFA97"/>
+        <w:category>
+          <w:name w:val="Общие"/>
+          <w:gallery w:val="placeholder"/>
+        </w:category>
+        <w:types>
+          <w:type w:val="bbPlcHdr"/>
+        </w:types>
+        <w:behaviors>
+          <w:behavior w:val="content"/>
+        </w:behaviors>
+        <w:guid w:val="{7FE445EB-E967-4DE2-B0F0-3370911490D7}"/>
+      </w:docPartPr>
+      <w:docPartBody>
+        <w:p>
+          <w:pPr>
+            <w:pStyle w:val="951A225EF0084B0BAB7353E9C0BAFA97"/>
+          </w:pPr>
+          <w:r>
+            <w:rPr>
+              <w:rStyle w:val="a3"/>
+            </w:rPr>
+            <w:t>Место для ввода текста.</w:t>
+          </w:r>
+        </w:p>
+      </w:docPartBody>
+    </w:docPart>
   </w:docParts>
 </w:glossaryDocument>
 </file>
@@ -2079,7 +2228,12 @@
   </w:compat>
   <w:rsids>
     <w:rsidRoot w:val="00591833"/>
+    <w:rsid w:val="002B3BA1"/>
+    <w:rsid w:val="0050562B"/>
     <w:rsid w:val="00591833"/>
+    <w:rsid w:val="006D5C39"/>
+    <w:rsid w:val="009272CC"/>
+    <w:rsid w:val="00F464D7"/>
     <w:rsid w:val="00F716ED"/>
   </w:rsids>
   <m:mathPr>
@@ -2532,9 +2686,29 @@
     <w:basedOn w:val="a0"/>
     <w:uiPriority w:val="99"/>
     <w:semiHidden/>
-    <w:rsid w:val="00591833"/>
+    <w:rsid w:val="002B3BA1"/>
     <w:rPr>
       <w:color w:val="808080"/>
+    </w:rPr>
+  </w:style>
+  <w:style w:type="paragraph" w:customStyle="1" w:styleId="0B10657EFB7A4E749CF332D707B4CB82">
+    <w:name w:val="0B10657EFB7A4E749CF332D707B4CB82"/>
+    <w:rsid w:val="002B3BA1"/>
+    <w:pPr>
+      <w:spacing w:after="160" w:line="259" w:lineRule="auto"/>
+    </w:pPr>
+    <w:rPr>
+      <w:lang w:val="ru-UA" w:eastAsia="ru-UA"/>
+    </w:rPr>
+  </w:style>
+  <w:style w:type="paragraph" w:customStyle="1" w:styleId="951A225EF0084B0BAB7353E9C0BAFA97">
+    <w:name w:val="951A225EF0084B0BAB7353E9C0BAFA97"/>
+    <w:rsid w:val="002B3BA1"/>
+    <w:pPr>
+      <w:spacing w:after="160" w:line="259" w:lineRule="auto"/>
+    </w:pPr>
+    <w:rPr>
+      <w:lang w:val="ru-UA" w:eastAsia="ru-UA"/>
     </w:rPr>
   </w:style>
 </w:styles>

</xml_diff>